<commit_message>
docs: add portfolio and open-source project links to CV
</commit_message>
<xml_diff>
--- a/CV_MikhailBinYassin.docx
+++ b/CV_MikhailBinYassin.docx
@@ -48,7 +48,7 @@
         <w:rPr>
           <w:sz w:val="19"/>
         </w:rPr>
-        <w:t xml:space="preserve">+60 12-887 1846 mikhailyassin@proton.me GitHub: mikhaiIy LinkedIn: mikhailyassin Kota Belud, Sabah, Malaysia </w:t>
+        <w:t xml:space="preserve">+60 12-887 1846 mikhailyassin@proton.me GitHub: mikhaiIy LinkedIn: mikhailyassin Kota Belud, Sabah, Malaysia Portfolio: mikhaily.dev </w:t>
       </w:r>
     </w:p>
     <w:p>
@@ -819,6 +819,155 @@
     </w:p>
     <w:p>
       <w:pPr>
+        <w:pStyle w:val="Heading3"/>
+        <w:bidi w:val="0"/>
+        <w:spacing w:before="40" w:after="160"/>
+        <w:ind w:hanging="0" w:start="0" w:end="0"/>
+        <w:jc w:val="start"/>
+        <w:rPr/>
+      </w:pPr>
+      <w:hyperlink r:id="rId6">
+        <w:r>
+          <w:rPr>
+            <w:rStyle w:val="Hyperlink"/>
+          </w:rPr>
+          <w:t>Omarchy → BB Theme Sync</w:t>
+        </w:r>
+      </w:hyperlink>
+    </w:p>
+    <w:p>
+      <w:pPr>
+        <w:pStyle w:val="BodyText"/>
+        <w:bidi w:val="0"/>
+        <w:spacing w:before="40" w:after="160"/>
+        <w:ind w:hanging="0" w:start="0" w:end="0"/>
+        <w:jc w:val="start"/>
+        <w:rPr>
+          <w:sz w:val="19"/>
+        </w:rPr>
+      </w:pPr>
+      <w:r>
+        <w:rPr>
+          <w:sz w:val="19"/>
+        </w:rPr>
+        <w:t>Open source · 2026</w:t>
+      </w:r>
+    </w:p>
+    <w:p>
+      <w:pPr>
+        <w:pStyle w:val="BodyText"/>
+        <w:bidi w:val="0"/>
+        <w:spacing w:before="40" w:after="160"/>
+        <w:jc w:val="start"/>
+        <w:rPr>
+          <w:b/>
+        </w:rPr>
+      </w:pPr>
+      <w:r>
+        <w:rPr>
+          <w:b/>
+        </w:rPr>
+        <w:t>Open-source systems integration</w:t>
+      </w:r>
+    </w:p>
+    <w:p>
+      <w:pPr>
+        <w:pStyle w:val="BodyText"/>
+        <w:numPr>
+          <w:ilvl w:val="0"/>
+          <w:numId w:val="6"/>
+        </w:numPr>
+        <w:tabs>
+          <w:tab w:val="clear" w:pos="1134"/>
+          <w:tab w:val="left" w:pos="749" w:leader="none"/>
+        </w:tabs>
+        <w:bidi w:val="0"/>
+        <w:spacing w:before="40" w:after="160"/>
+        <w:ind w:hanging="283" w:start="749"/>
+        <w:jc w:val="start"/>
+        <w:rPr/>
+      </w:pPr>
+      <w:r>
+        <w:rPr/>
+        <w:t xml:space="preserve">Designed a Bash integration that maps Omarchy </w:t>
+      </w:r>
+      <w:r>
+        <w:rPr>
+          <w:rStyle w:val="SourceText"/>
+        </w:rPr>
+        <w:t>colors.toml</w:t>
+      </w:r>
+      <w:r>
+        <w:rPr/>
+        <w:t xml:space="preserve"> values to BB custom CSS themes and activates them through the </w:t>
+      </w:r>
+      <w:r>
+        <w:rPr>
+          <w:rStyle w:val="SourceText"/>
+        </w:rPr>
+        <w:t>theme-set.d</w:t>
+      </w:r>
+      <w:r>
+        <w:rPr/>
+        <w:t xml:space="preserve"> hook. </w:t>
+      </w:r>
+    </w:p>
+    <w:p>
+      <w:pPr>
+        <w:pStyle w:val="BodyText"/>
+        <w:numPr>
+          <w:ilvl w:val="0"/>
+          <w:numId w:val="6"/>
+        </w:numPr>
+        <w:tabs>
+          <w:tab w:val="clear" w:pos="1134"/>
+          <w:tab w:val="left" w:pos="749" w:leader="none"/>
+        </w:tabs>
+        <w:bidi w:val="0"/>
+        <w:spacing w:before="40" w:after="160"/>
+        <w:ind w:hanging="283" w:start="749"/>
+        <w:jc w:val="start"/>
+        <w:rPr/>
+      </w:pPr>
+      <w:r>
+        <w:rPr/>
+        <w:t xml:space="preserve">Implemented atomic stylesheet writes, scoped symlink installation, safe uninstall behaviour, light/dark palette handling, and AppImage/packaged BB CLI discovery. </w:t>
+      </w:r>
+    </w:p>
+    <w:p>
+      <w:pPr>
+        <w:pStyle w:val="BodyText"/>
+        <w:numPr>
+          <w:ilvl w:val="0"/>
+          <w:numId w:val="6"/>
+        </w:numPr>
+        <w:tabs>
+          <w:tab w:val="clear" w:pos="1134"/>
+          <w:tab w:val="left" w:pos="749" w:leader="none"/>
+        </w:tabs>
+        <w:bidi w:val="0"/>
+        <w:spacing w:before="40" w:after="160"/>
+        <w:ind w:hanging="283" w:start="749"/>
+        <w:jc w:val="start"/>
+        <w:rPr/>
+      </w:pPr>
+      <w:r>
+        <w:rPr/>
+        <w:t xml:space="preserve">Added an isolated verification suite, GitHub Actions CI, contribution guidelines, issue templates, security policy, and a tagged </w:t>
+      </w:r>
+      <w:r>
+        <w:rPr>
+          <w:rStyle w:val="Strong"/>
+        </w:rPr>
+        <w:t>v0.1.0</w:t>
+      </w:r>
+      <w:r>
+        <w:rPr/>
+        <w:t xml:space="preserve"> release. </w:t>
+      </w:r>
+    </w:p>
+    <w:p>
+      <w:pPr>
         <w:pStyle w:val="Heading2"/>
         <w:numPr>
           <w:ilvl w:val="0"/>
@@ -966,7 +1115,7 @@
         <w:pStyle w:val="BodyText"/>
         <w:numPr>
           <w:ilvl w:val="0"/>
-          <w:numId w:val="6"/>
+          <w:numId w:val="7"/>
         </w:numPr>
         <w:tabs>
           <w:tab w:val="clear" w:pos="1134"/>
@@ -988,7 +1137,7 @@
         <w:pStyle w:val="BodyText"/>
         <w:numPr>
           <w:ilvl w:val="0"/>
-          <w:numId w:val="6"/>
+          <w:numId w:val="7"/>
         </w:numPr>
         <w:tabs>
           <w:tab w:val="clear" w:pos="1134"/>
@@ -1010,7 +1159,7 @@
         <w:pStyle w:val="BodyText"/>
         <w:numPr>
           <w:ilvl w:val="0"/>
-          <w:numId w:val="6"/>
+          <w:numId w:val="7"/>
         </w:numPr>
         <w:tabs>
           <w:tab w:val="clear" w:pos="1134"/>
@@ -1032,7 +1181,7 @@
         <w:pStyle w:val="BodyText"/>
         <w:numPr>
           <w:ilvl w:val="0"/>
-          <w:numId w:val="6"/>
+          <w:numId w:val="7"/>
         </w:numPr>
         <w:tabs>
           <w:tab w:val="clear" w:pos="1134"/>
@@ -1074,7 +1223,7 @@
         <w:pStyle w:val="BodyText"/>
         <w:numPr>
           <w:ilvl w:val="0"/>
-          <w:numId w:val="7"/>
+          <w:numId w:val="8"/>
         </w:numPr>
         <w:tabs>
           <w:tab w:val="clear" w:pos="1134"/>
@@ -1102,7 +1251,7 @@
         <w:pStyle w:val="BodyText"/>
         <w:numPr>
           <w:ilvl w:val="0"/>
-          <w:numId w:val="7"/>
+          <w:numId w:val="8"/>
         </w:numPr>
         <w:tabs>
           <w:tab w:val="clear" w:pos="1134"/>
@@ -1130,7 +1279,7 @@
         <w:pStyle w:val="BodyText"/>
         <w:numPr>
           <w:ilvl w:val="0"/>
-          <w:numId w:val="7"/>
+          <w:numId w:val="8"/>
         </w:numPr>
         <w:tabs>
           <w:tab w:val="clear" w:pos="1134"/>
@@ -2007,6 +2156,143 @@
     </w:lvl>
   </w:abstractNum>
   <w:abstractNum w:abstractNumId="7">
+    <w:lvl w:ilvl="0">
+      <w:start w:val="1"/>
+      <w:numFmt w:val="bullet"/>
+      <w:lvlText w:val=""/>
+      <w:lvlJc w:val="start"/>
+      <w:pPr>
+        <w:tabs>
+          <w:tab w:val="num" w:pos="709"/>
+        </w:tabs>
+        <w:ind w:start="709" w:hanging="283"/>
+      </w:pPr>
+      <w:rPr>
+        <w:rFonts w:ascii="Symbol" w:hAnsi="Symbol" w:cs="Symbol" w:hint="default"/>
+      </w:rPr>
+    </w:lvl>
+    <w:lvl w:ilvl="1">
+      <w:start w:val="1"/>
+      <w:numFmt w:val="bullet"/>
+      <w:lvlText w:val=""/>
+      <w:lvlJc w:val="start"/>
+      <w:pPr>
+        <w:tabs>
+          <w:tab w:val="num" w:pos="1418"/>
+        </w:tabs>
+        <w:ind w:start="1418" w:hanging="283"/>
+      </w:pPr>
+      <w:rPr>
+        <w:rFonts w:ascii="Symbol" w:hAnsi="Symbol" w:cs="Symbol" w:hint="default"/>
+      </w:rPr>
+    </w:lvl>
+    <w:lvl w:ilvl="2">
+      <w:start w:val="1"/>
+      <w:numFmt w:val="bullet"/>
+      <w:lvlText w:val=""/>
+      <w:lvlJc w:val="start"/>
+      <w:pPr>
+        <w:tabs>
+          <w:tab w:val="num" w:pos="2127"/>
+        </w:tabs>
+        <w:ind w:start="2127" w:hanging="283"/>
+      </w:pPr>
+      <w:rPr>
+        <w:rFonts w:ascii="Symbol" w:hAnsi="Symbol" w:cs="Symbol" w:hint="default"/>
+      </w:rPr>
+    </w:lvl>
+    <w:lvl w:ilvl="3">
+      <w:start w:val="1"/>
+      <w:numFmt w:val="bullet"/>
+      <w:lvlText w:val=""/>
+      <w:lvlJc w:val="start"/>
+      <w:pPr>
+        <w:tabs>
+          <w:tab w:val="num" w:pos="2836"/>
+        </w:tabs>
+        <w:ind w:start="2836" w:hanging="283"/>
+      </w:pPr>
+      <w:rPr>
+        <w:rFonts w:ascii="Symbol" w:hAnsi="Symbol" w:cs="Symbol" w:hint="default"/>
+      </w:rPr>
+    </w:lvl>
+    <w:lvl w:ilvl="4">
+      <w:start w:val="1"/>
+      <w:numFmt w:val="bullet"/>
+      <w:lvlText w:val=""/>
+      <w:lvlJc w:val="start"/>
+      <w:pPr>
+        <w:tabs>
+          <w:tab w:val="num" w:pos="3545"/>
+        </w:tabs>
+        <w:ind w:start="3545" w:hanging="283"/>
+      </w:pPr>
+      <w:rPr>
+        <w:rFonts w:ascii="Symbol" w:hAnsi="Symbol" w:cs="Symbol" w:hint="default"/>
+      </w:rPr>
+    </w:lvl>
+    <w:lvl w:ilvl="5">
+      <w:start w:val="1"/>
+      <w:numFmt w:val="bullet"/>
+      <w:lvlText w:val=""/>
+      <w:lvlJc w:val="start"/>
+      <w:pPr>
+        <w:tabs>
+          <w:tab w:val="num" w:pos="4254"/>
+        </w:tabs>
+        <w:ind w:start="4254" w:hanging="283"/>
+      </w:pPr>
+      <w:rPr>
+        <w:rFonts w:ascii="Symbol" w:hAnsi="Symbol" w:cs="Symbol" w:hint="default"/>
+      </w:rPr>
+    </w:lvl>
+    <w:lvl w:ilvl="6">
+      <w:start w:val="1"/>
+      <w:numFmt w:val="bullet"/>
+      <w:lvlText w:val=""/>
+      <w:lvlJc w:val="start"/>
+      <w:pPr>
+        <w:tabs>
+          <w:tab w:val="num" w:pos="4963"/>
+        </w:tabs>
+        <w:ind w:start="4963" w:hanging="283"/>
+      </w:pPr>
+      <w:rPr>
+        <w:rFonts w:ascii="Symbol" w:hAnsi="Symbol" w:cs="Symbol" w:hint="default"/>
+      </w:rPr>
+    </w:lvl>
+    <w:lvl w:ilvl="7">
+      <w:start w:val="1"/>
+      <w:numFmt w:val="bullet"/>
+      <w:lvlText w:val=""/>
+      <w:lvlJc w:val="start"/>
+      <w:pPr>
+        <w:tabs>
+          <w:tab w:val="num" w:pos="5672"/>
+        </w:tabs>
+        <w:ind w:start="5672" w:hanging="283"/>
+      </w:pPr>
+      <w:rPr>
+        <w:rFonts w:ascii="Symbol" w:hAnsi="Symbol" w:cs="Symbol" w:hint="default"/>
+      </w:rPr>
+    </w:lvl>
+    <w:lvl w:ilvl="8">
+      <w:start w:val="1"/>
+      <w:numFmt w:val="bullet"/>
+      <w:lvlText w:val=""/>
+      <w:lvlJc w:val="start"/>
+      <w:pPr>
+        <w:tabs>
+          <w:tab w:val="num" w:pos="6381"/>
+        </w:tabs>
+        <w:ind w:start="6381" w:hanging="283"/>
+      </w:pPr>
+      <w:rPr>
+        <w:rFonts w:ascii="Symbol" w:hAnsi="Symbol" w:cs="Symbol" w:hint="default"/>
+      </w:rPr>
+    </w:lvl>
+  </w:abstractNum>
+  <w:abstractNum w:abstractNumId="8">
     <w:lvl w:ilvl="0">
       <w:start w:val="1"/>
       <w:numFmt w:val="bullet"/>
@@ -2163,6 +2449,9 @@
   </w:num>
   <w:num w:numId="7">
     <w:abstractNumId w:val="7"/>
+  </w:num>
+  <w:num w:numId="8">
+    <w:abstractNumId w:val="8"/>
   </w:num>
 </w:numbering>
 </file>
@@ -2318,6 +2607,13 @@
       <w:color w:val="800000"/>
       <w:u w:val="none"/>
       <w:effect w:val="none"/>
+    </w:rPr>
+  </w:style>
+  <w:style w:type="character" w:styleId="SourceText">
+    <w:name w:val="Source Text"/>
+    <w:qFormat/>
+    <w:rPr>
+      <w:rFonts w:ascii="Liberation Mono" w:hAnsi="Liberation Mono" w:eastAsia="Noto Sans Mono CJK SC" w:cs="Liberation Mono"/>
     </w:rPr>
   </w:style>
   <w:style w:type="paragraph" w:styleId="HorizontalLine">

</xml_diff>